<commit_message>
docs: update lab report document
</commit_message>
<xml_diff>
--- a/Lab 9 documents 6733802721 Sec1.docx
+++ b/Lab 9 documents 6733802721 Sec1.docx
@@ -99,7 +99,7 @@
           <w:cs/>
         </w:rPr>
         <w:drawing>
-          <wp:inline distT="0" distB="0" distL="0" distR="0" wp14:anchorId="5D8E94D7" wp14:editId="2D8A150F">
+          <wp:inline distT="0" distB="0" distL="0" distR="0" wp14:anchorId="5D8E94D7" wp14:editId="3C2CE9BA">
             <wp:extent cx="6450330" cy="2844264"/>
             <wp:effectExtent l="0" t="0" r="7620" b="0"/>
             <wp:docPr id="1893444313" name="รูปภาพ 1"/>
@@ -1783,6 +1783,677 @@
         </w:rPr>
       </w:pPr>
     </w:p>
+    <w:p>
+      <w:pPr>
+        <w:numPr>
+          <w:ilvl w:val="0"/>
+          <w:numId w:val="2"/>
+        </w:numPr>
+        <w:rPr>
+          <w:sz w:val="28"/>
+          <w:szCs w:val="28"/>
+        </w:rPr>
+      </w:pPr>
+      <w:r>
+        <w:rPr>
+          <w:sz w:val="28"/>
+          <w:szCs w:val="28"/>
+        </w:rPr>
+        <w:lastRenderedPageBreak/>
+        <w:t>@Transactional </w:t>
+      </w:r>
+      <w:r>
+        <w:rPr>
+          <w:sz w:val="28"/>
+          <w:szCs w:val="28"/>
+          <w:cs/>
+        </w:rPr>
+        <w:t>มีหน้าที่อะไร</w:t>
+      </w:r>
+      <w:r>
+        <w:rPr>
+          <w:sz w:val="28"/>
+          <w:szCs w:val="28"/>
+        </w:rPr>
+        <w:t>?</w:t>
+      </w:r>
+    </w:p>
+    <w:p>
+      <w:pPr>
+        <w:ind w:left="720"/>
+        <w:rPr>
+          <w:sz w:val="28"/>
+          <w:szCs w:val="28"/>
+        </w:rPr>
+      </w:pPr>
+      <w:r>
+        <w:rPr>
+          <w:sz w:val="28"/>
+          <w:szCs w:val="28"/>
+          <w:cs/>
+        </w:rPr>
+        <w:t>ควบคุมชุดคำสั่งที่ทำงาน</w:t>
+      </w:r>
+      <w:r>
+        <w:rPr>
+          <w:rFonts w:hint="cs"/>
+          <w:sz w:val="28"/>
+          <w:szCs w:val="28"/>
+          <w:cs/>
+        </w:rPr>
+        <w:t xml:space="preserve">ให้เป็นแบบ </w:t>
+      </w:r>
+      <w:r>
+        <w:rPr>
+          <w:sz w:val="28"/>
+          <w:szCs w:val="28"/>
+        </w:rPr>
+        <w:t xml:space="preserve">All or Nothing </w:t>
+      </w:r>
+      <w:r>
+        <w:rPr>
+          <w:rFonts w:hint="cs"/>
+          <w:sz w:val="28"/>
+          <w:szCs w:val="28"/>
+          <w:cs/>
+        </w:rPr>
+        <w:t>ถ้า</w:t>
+      </w:r>
+      <w:r>
+        <w:rPr>
+          <w:sz w:val="28"/>
+          <w:szCs w:val="28"/>
+          <w:cs/>
+        </w:rPr>
+        <w:t>ทำงานสำเร็จทั้งหมดจะบันทึกข้อมูล</w:t>
+      </w:r>
+      <w:r>
+        <w:rPr>
+          <w:rFonts w:hint="cs"/>
+          <w:sz w:val="28"/>
+          <w:szCs w:val="28"/>
+          <w:cs/>
+        </w:rPr>
+        <w:t xml:space="preserve"> ถ้าเกิดข้อผิดพลาดจะยกเลิก และ </w:t>
+      </w:r>
+      <w:r>
+        <w:rPr>
+          <w:sz w:val="28"/>
+          <w:szCs w:val="28"/>
+        </w:rPr>
+        <w:t>Rollback</w:t>
+      </w:r>
+    </w:p>
+    <w:p>
+      <w:pPr>
+        <w:ind w:left="720"/>
+        <w:rPr>
+          <w:sz w:val="28"/>
+          <w:szCs w:val="28"/>
+        </w:rPr>
+      </w:pPr>
+    </w:p>
+    <w:p>
+      <w:pPr>
+        <w:numPr>
+          <w:ilvl w:val="0"/>
+          <w:numId w:val="2"/>
+        </w:numPr>
+        <w:rPr>
+          <w:sz w:val="28"/>
+          <w:szCs w:val="28"/>
+        </w:rPr>
+      </w:pPr>
+      <w:r>
+        <w:rPr>
+          <w:sz w:val="28"/>
+          <w:szCs w:val="28"/>
+          <w:cs/>
+        </w:rPr>
+        <w:t xml:space="preserve">เพราะเหตุใดการฝากเงินจึงควรใช้ </w:t>
+      </w:r>
+      <w:r>
+        <w:rPr>
+          <w:sz w:val="28"/>
+          <w:szCs w:val="28"/>
+        </w:rPr>
+        <w:t>Transaction?</w:t>
+      </w:r>
+    </w:p>
+    <w:p>
+      <w:pPr>
+        <w:ind w:left="720"/>
+        <w:rPr>
+          <w:sz w:val="28"/>
+          <w:szCs w:val="28"/>
+        </w:rPr>
+      </w:pPr>
+      <w:r>
+        <w:rPr>
+          <w:rFonts w:hint="cs"/>
+          <w:sz w:val="28"/>
+          <w:szCs w:val="28"/>
+          <w:cs/>
+        </w:rPr>
+        <w:t>เพราะมีหลายขั้นตอนที่ต้องทำต่อเนื่องกัน ถ้า</w:t>
+      </w:r>
+      <w:r>
+        <w:rPr>
+          <w:sz w:val="28"/>
+          <w:szCs w:val="28"/>
+          <w:cs/>
+        </w:rPr>
+        <w:t xml:space="preserve">ไม่มี </w:t>
+      </w:r>
+      <w:r>
+        <w:rPr>
+          <w:sz w:val="28"/>
+          <w:szCs w:val="28"/>
+        </w:rPr>
+        <w:t xml:space="preserve">Transaction </w:t>
+      </w:r>
+      <w:r>
+        <w:rPr>
+          <w:sz w:val="28"/>
+          <w:szCs w:val="28"/>
+          <w:cs/>
+        </w:rPr>
+        <w:t>แล้วเกิดข้อผิดพลาดระหว่างทาง จะทำให้ข้อมูลไม่ตรงกันและไม่สอดคล้องกัน</w:t>
+      </w:r>
+    </w:p>
+    <w:p>
+      <w:pPr>
+        <w:rPr>
+          <w:rFonts w:hint="cs"/>
+          <w:sz w:val="28"/>
+          <w:szCs w:val="28"/>
+        </w:rPr>
+      </w:pPr>
+    </w:p>
+    <w:p>
+      <w:pPr>
+        <w:numPr>
+          <w:ilvl w:val="0"/>
+          <w:numId w:val="2"/>
+        </w:numPr>
+        <w:rPr>
+          <w:sz w:val="28"/>
+          <w:szCs w:val="28"/>
+        </w:rPr>
+      </w:pPr>
+      <w:r>
+        <w:rPr>
+          <w:sz w:val="28"/>
+          <w:szCs w:val="28"/>
+        </w:rPr>
+        <w:t xml:space="preserve">COMMIT </w:t>
+      </w:r>
+      <w:r>
+        <w:rPr>
+          <w:sz w:val="28"/>
+          <w:szCs w:val="28"/>
+          <w:cs/>
+        </w:rPr>
+        <w:t xml:space="preserve">และ </w:t>
+      </w:r>
+      <w:r>
+        <w:rPr>
+          <w:sz w:val="28"/>
+          <w:szCs w:val="28"/>
+        </w:rPr>
+        <w:t xml:space="preserve">ROLLBACK </w:t>
+      </w:r>
+      <w:r>
+        <w:rPr>
+          <w:sz w:val="28"/>
+          <w:szCs w:val="28"/>
+          <w:cs/>
+        </w:rPr>
+        <w:t>ต่างกันอย่างไร</w:t>
+      </w:r>
+      <w:r>
+        <w:rPr>
+          <w:sz w:val="28"/>
+          <w:szCs w:val="28"/>
+        </w:rPr>
+        <w:t>?</w:t>
+      </w:r>
+    </w:p>
+    <w:p>
+      <w:pPr>
+        <w:pStyle w:val="a9"/>
+        <w:numPr>
+          <w:ilvl w:val="1"/>
+          <w:numId w:val="2"/>
+        </w:numPr>
+        <w:rPr>
+          <w:sz w:val="28"/>
+          <w:szCs w:val="28"/>
+        </w:rPr>
+      </w:pPr>
+      <w:r>
+        <w:rPr>
+          <w:sz w:val="28"/>
+          <w:szCs w:val="28"/>
+        </w:rPr>
+        <w:t xml:space="preserve">Commit </w:t>
+      </w:r>
+      <w:r>
+        <w:rPr>
+          <w:sz w:val="28"/>
+          <w:szCs w:val="28"/>
+          <w:cs/>
+        </w:rPr>
+        <w:t xml:space="preserve">คือการยืนยันและบันทึกการเปลี่ยนแปลงของข้อมูลลง </w:t>
+      </w:r>
+      <w:r>
+        <w:rPr>
+          <w:sz w:val="28"/>
+          <w:szCs w:val="28"/>
+        </w:rPr>
+        <w:t xml:space="preserve">Database </w:t>
+      </w:r>
+      <w:r>
+        <w:rPr>
+          <w:sz w:val="28"/>
+          <w:szCs w:val="28"/>
+          <w:cs/>
+        </w:rPr>
+        <w:t>จริงอย่างถาวร เมื่อทุกคำสั่งทำงานสำเร็จครบถ้วน</w:t>
+      </w:r>
+    </w:p>
+    <w:p>
+      <w:pPr>
+        <w:pStyle w:val="a9"/>
+        <w:numPr>
+          <w:ilvl w:val="1"/>
+          <w:numId w:val="2"/>
+        </w:numPr>
+        <w:rPr>
+          <w:sz w:val="28"/>
+          <w:szCs w:val="28"/>
+        </w:rPr>
+      </w:pPr>
+      <w:r>
+        <w:rPr>
+          <w:sz w:val="28"/>
+          <w:szCs w:val="28"/>
+        </w:rPr>
+        <w:t xml:space="preserve">Rollback </w:t>
+      </w:r>
+      <w:r>
+        <w:rPr>
+          <w:sz w:val="28"/>
+          <w:szCs w:val="28"/>
+          <w:cs/>
+        </w:rPr>
+        <w:t>คือการยกเลิกคำสั่งทั้งหมด และย้อนข้อมูลกลับไปเป็นสถานะเดิมก่อนเริ่มทำรายการ เมื่อเกิดข้อผิดพลาดขึ้น</w:t>
+      </w:r>
+    </w:p>
+    <w:p>
+      <w:pPr>
+        <w:pStyle w:val="a9"/>
+        <w:ind w:left="1440"/>
+        <w:rPr>
+          <w:rFonts w:hint="cs"/>
+          <w:sz w:val="28"/>
+          <w:szCs w:val="28"/>
+        </w:rPr>
+      </w:pPr>
+    </w:p>
+    <w:p>
+      <w:pPr>
+        <w:numPr>
+          <w:ilvl w:val="0"/>
+          <w:numId w:val="2"/>
+        </w:numPr>
+        <w:rPr>
+          <w:sz w:val="28"/>
+          <w:szCs w:val="28"/>
+        </w:rPr>
+      </w:pPr>
+      <w:r>
+        <w:rPr>
+          <w:sz w:val="28"/>
+          <w:szCs w:val="28"/>
+        </w:rPr>
+        <w:t xml:space="preserve">Account </w:t>
+      </w:r>
+      <w:r>
+        <w:rPr>
+          <w:sz w:val="28"/>
+          <w:szCs w:val="28"/>
+          <w:cs/>
+        </w:rPr>
+        <w:t xml:space="preserve">และ </w:t>
+      </w:r>
+      <w:r>
+        <w:rPr>
+          <w:sz w:val="28"/>
+          <w:szCs w:val="28"/>
+        </w:rPr>
+        <w:t xml:space="preserve">DepositTransaction </w:t>
+      </w:r>
+      <w:r>
+        <w:rPr>
+          <w:sz w:val="28"/>
+          <w:szCs w:val="28"/>
+          <w:cs/>
+        </w:rPr>
+        <w:t>มีความสัมพันธ์แบบใด</w:t>
+      </w:r>
+      <w:r>
+        <w:rPr>
+          <w:sz w:val="28"/>
+          <w:szCs w:val="28"/>
+        </w:rPr>
+        <w:t>?</w:t>
+      </w:r>
+    </w:p>
+    <w:p>
+      <w:pPr>
+        <w:ind w:left="720"/>
+        <w:rPr>
+          <w:sz w:val="28"/>
+          <w:szCs w:val="28"/>
+        </w:rPr>
+      </w:pPr>
+      <w:r>
+        <w:rPr>
+          <w:rFonts w:hint="cs"/>
+          <w:sz w:val="28"/>
+          <w:szCs w:val="28"/>
+          <w:cs/>
+        </w:rPr>
+        <w:t xml:space="preserve">แบบ </w:t>
+      </w:r>
+      <w:r>
+        <w:rPr>
+          <w:sz w:val="28"/>
+          <w:szCs w:val="28"/>
+        </w:rPr>
+        <w:t>One-to-Many</w:t>
+      </w:r>
+    </w:p>
+    <w:p>
+      <w:pPr>
+        <w:ind w:left="720"/>
+        <w:rPr>
+          <w:rFonts w:hint="cs"/>
+          <w:sz w:val="28"/>
+          <w:szCs w:val="28"/>
+        </w:rPr>
+      </w:pPr>
+    </w:p>
+    <w:p>
+      <w:pPr>
+        <w:numPr>
+          <w:ilvl w:val="0"/>
+          <w:numId w:val="2"/>
+        </w:numPr>
+        <w:rPr>
+          <w:sz w:val="28"/>
+          <w:szCs w:val="28"/>
+        </w:rPr>
+      </w:pPr>
+      <w:r>
+        <w:rPr>
+          <w:sz w:val="28"/>
+          <w:szCs w:val="28"/>
+          <w:cs/>
+        </w:rPr>
+        <w:t xml:space="preserve">เมื่อเกิด </w:t>
+      </w:r>
+      <w:r>
+        <w:rPr>
+          <w:sz w:val="28"/>
+          <w:szCs w:val="28"/>
+        </w:rPr>
+        <w:t xml:space="preserve">Error </w:t>
+      </w:r>
+      <w:r>
+        <w:rPr>
+          <w:sz w:val="28"/>
+          <w:szCs w:val="28"/>
+          <w:cs/>
+        </w:rPr>
+        <w:t>ขณะใช้</w:t>
+      </w:r>
+      <w:r>
+        <w:rPr>
+          <w:sz w:val="28"/>
+          <w:szCs w:val="28"/>
+        </w:rPr>
+        <w:t> @Transactional </w:t>
+      </w:r>
+      <w:r>
+        <w:rPr>
+          <w:sz w:val="28"/>
+          <w:szCs w:val="28"/>
+          <w:cs/>
+        </w:rPr>
+        <w:t xml:space="preserve">ข้อมูลใน </w:t>
+      </w:r>
+      <w:r>
+        <w:rPr>
+          <w:sz w:val="28"/>
+          <w:szCs w:val="28"/>
+        </w:rPr>
+        <w:t xml:space="preserve">Database </w:t>
+      </w:r>
+      <w:r>
+        <w:rPr>
+          <w:sz w:val="28"/>
+          <w:szCs w:val="28"/>
+          <w:cs/>
+        </w:rPr>
+        <w:t>เปลี่ยนแปลงอย่างไร</w:t>
+      </w:r>
+      <w:r>
+        <w:rPr>
+          <w:sz w:val="28"/>
+          <w:szCs w:val="28"/>
+        </w:rPr>
+        <w:t>?</w:t>
+      </w:r>
+    </w:p>
+    <w:p>
+      <w:pPr>
+        <w:ind w:left="720"/>
+        <w:rPr>
+          <w:sz w:val="28"/>
+          <w:szCs w:val="28"/>
+        </w:rPr>
+      </w:pPr>
+      <w:r>
+        <w:rPr>
+          <w:rFonts w:hint="cs"/>
+          <w:sz w:val="28"/>
+          <w:szCs w:val="28"/>
+          <w:cs/>
+        </w:rPr>
+        <w:t xml:space="preserve">ไม่เกิดอะไรขึ้น ข้อมูลใน </w:t>
+      </w:r>
+      <w:r>
+        <w:rPr>
+          <w:sz w:val="28"/>
+          <w:szCs w:val="28"/>
+        </w:rPr>
+        <w:t xml:space="preserve">Database </w:t>
+      </w:r>
+      <w:r>
+        <w:rPr>
+          <w:rFonts w:hint="cs"/>
+          <w:sz w:val="28"/>
+          <w:szCs w:val="28"/>
+          <w:cs/>
+        </w:rPr>
+        <w:t xml:space="preserve">จะถูกสั่ง </w:t>
+      </w:r>
+      <w:r>
+        <w:rPr>
+          <w:sz w:val="28"/>
+          <w:szCs w:val="28"/>
+        </w:rPr>
+        <w:t xml:space="preserve">Rollback </w:t>
+      </w:r>
+      <w:r>
+        <w:rPr>
+          <w:rFonts w:hint="cs"/>
+          <w:sz w:val="28"/>
+          <w:szCs w:val="28"/>
+          <w:cs/>
+        </w:rPr>
+        <w:t>ย้อนกลับไปเหมือนไม่มีอะไรเกิดขึ้น</w:t>
+      </w:r>
+    </w:p>
+    <w:p>
+      <w:pPr>
+        <w:ind w:left="720"/>
+        <w:rPr>
+          <w:rFonts w:hint="cs"/>
+          <w:sz w:val="28"/>
+          <w:szCs w:val="28"/>
+        </w:rPr>
+      </w:pPr>
+    </w:p>
+    <w:p>
+      <w:pPr>
+        <w:numPr>
+          <w:ilvl w:val="0"/>
+          <w:numId w:val="2"/>
+        </w:numPr>
+        <w:rPr>
+          <w:sz w:val="28"/>
+          <w:szCs w:val="28"/>
+        </w:rPr>
+      </w:pPr>
+      <w:r>
+        <w:rPr>
+          <w:sz w:val="28"/>
+          <w:szCs w:val="28"/>
+          <w:cs/>
+        </w:rPr>
+        <w:t>จากการทดลอง เมื่อลบ</w:t>
+      </w:r>
+      <w:r>
+        <w:rPr>
+          <w:sz w:val="28"/>
+          <w:szCs w:val="28"/>
+        </w:rPr>
+        <w:t> @Transactional </w:t>
+      </w:r>
+      <w:r>
+        <w:rPr>
+          <w:sz w:val="28"/>
+          <w:szCs w:val="28"/>
+          <w:cs/>
+        </w:rPr>
+        <w:t>ออก ผลลัพธ์แตกต่างจากเดิมอย่างไร</w:t>
+      </w:r>
+      <w:r>
+        <w:rPr>
+          <w:sz w:val="28"/>
+          <w:szCs w:val="28"/>
+        </w:rPr>
+        <w:t>?</w:t>
+      </w:r>
+    </w:p>
+    <w:p>
+      <w:pPr>
+        <w:ind w:left="720"/>
+        <w:rPr>
+          <w:rFonts w:hint="cs"/>
+          <w:sz w:val="28"/>
+          <w:szCs w:val="28"/>
+        </w:rPr>
+      </w:pPr>
+      <w:r>
+        <w:rPr>
+          <w:sz w:val="28"/>
+          <w:szCs w:val="28"/>
+          <w:cs/>
+        </w:rPr>
+        <w:t xml:space="preserve">คำสั่งที่ทำงานไปแล้วก่อนเกิด </w:t>
+      </w:r>
+      <w:r>
+        <w:rPr>
+          <w:sz w:val="28"/>
+          <w:szCs w:val="28"/>
+        </w:rPr>
+        <w:t>Error</w:t>
+      </w:r>
+      <w:r>
+        <w:rPr>
+          <w:sz w:val="28"/>
+          <w:szCs w:val="28"/>
+        </w:rPr>
+        <w:t xml:space="preserve"> </w:t>
+      </w:r>
+      <w:r>
+        <w:rPr>
+          <w:sz w:val="28"/>
+          <w:szCs w:val="28"/>
+          <w:cs/>
+        </w:rPr>
+        <w:t>จะยังคงถูกบันทึกค้างอยู่ใน</w:t>
+      </w:r>
+      <w:r>
+        <w:rPr>
+          <w:rFonts w:hint="cs"/>
+          <w:sz w:val="28"/>
+          <w:szCs w:val="28"/>
+          <w:cs/>
+        </w:rPr>
+        <w:t xml:space="preserve"> </w:t>
+      </w:r>
+      <w:r>
+        <w:rPr>
+          <w:sz w:val="28"/>
+          <w:szCs w:val="28"/>
+        </w:rPr>
+        <w:t>Database</w:t>
+      </w:r>
+      <w:r>
+        <w:rPr>
+          <w:sz w:val="28"/>
+          <w:szCs w:val="28"/>
+        </w:rPr>
+        <w:t xml:space="preserve"> </w:t>
+      </w:r>
+      <w:r>
+        <w:rPr>
+          <w:sz w:val="28"/>
+          <w:szCs w:val="28"/>
+          <w:cs/>
+        </w:rPr>
+        <w:t>จริง ไม่มีการย้อนกลับ</w:t>
+      </w:r>
+      <w:r>
+        <w:rPr>
+          <w:sz w:val="28"/>
+          <w:szCs w:val="28"/>
+        </w:rPr>
+        <w:t xml:space="preserve"> </w:t>
+      </w:r>
+      <w:r>
+        <w:rPr>
+          <w:rFonts w:hint="cs"/>
+          <w:sz w:val="28"/>
+          <w:szCs w:val="28"/>
+          <w:cs/>
+        </w:rPr>
+        <w:t>ทำให้ข้อมูลผิดพลาด</w:t>
+      </w:r>
+    </w:p>
+    <w:p>
+      <w:pPr>
+        <w:rPr>
+          <w:sz w:val="28"/>
+          <w:szCs w:val="28"/>
+        </w:rPr>
+      </w:pPr>
+    </w:p>
     <w:sectPr>
       <w:pgSz w:w="11906" w:h="16838"/>
       <w:pgMar w:top="1440" w:right="1440" w:bottom="1440" w:left="1440" w:header="708" w:footer="708" w:gutter="0"/>
@@ -1796,6 +2467,118 @@
 <file path=word/numbering.xml><?xml version="1.0" encoding="utf-8"?>
 <w:numbering xmlns:wpc="http://schemas.microsoft.com/office/word/2010/wordprocessingCanvas" xmlns:cx="http://schemas.microsoft.com/office/drawing/2014/chartex" xmlns:cx1="http://schemas.microsoft.com/office/drawing/2015/9/8/chartex" xmlns:cx2="http://schemas.microsoft.com/office/drawing/2015/10/21/chartex" xmlns:cx3="http://schemas.microsoft.com/office/drawing/2016/5/9/chartex" xmlns:cx4="http://schemas.microsoft.com/office/drawing/2016/5/10/chartex" xmlns:cx5="http://schemas.microsoft.com/office/drawing/2016/5/11/chartex" xmlns:cx6="http://schemas.microsoft.com/office/drawing/2016/5/12/chartex" xmlns:cx7="http://schemas.microsoft.com/office/drawing/2016/5/13/chartex" xmlns:cx8="http://schemas.microsoft.com/office/drawing/2016/5/14/chartex" xmlns:mc="http://schemas.openxmlformats.org/markup-compatibility/2006" xmlns:aink="http://schemas.microsoft.com/office/drawing/2016/ink" xmlns:am3d="http://schemas.microsoft.com/office/drawing/2017/model3d" xmlns:o="urn:schemas-microsoft-com:office:office" xmlns:oel="http://schemas.microsoft.com/office/2019/extlst" xmlns:r="http://schemas.openxmlformats.org/officeDocument/2006/relationships" xmlns:m="http://schemas.openxmlformats.org/officeDocument/2006/math" xmlns:v="urn:schemas-microsoft-com:vml" xmlns:wp14="http://schemas.microsoft.com/office/word/2010/wordprocessingDrawing" xmlns:wp="http://schemas.openxmlformats.org/drawingml/2006/wordprocessingDrawing" xmlns:w10="urn:schemas-microsoft-com:office:word" xmlns:w="http://schemas.openxmlformats.org/wordprocessingml/2006/main" xmlns:w14="http://schemas.microsoft.com/office/word/2010/wordml" xmlns:w15="http://schemas.microsoft.com/office/word/2012/wordml" xmlns:w16cex="http://schemas.microsoft.com/office/word/2018/wordml/cex" xmlns:w16cid="http://schemas.microsoft.com/office/word/2016/wordml/cid" xmlns:w16="http://schemas.microsoft.com/office/word/2018/wordml" xmlns:w16du="http://schemas.microsoft.com/office/word/2023/wordml/word16du" xmlns:w16sdtdh="http://schemas.microsoft.com/office/word/2020/wordml/sdtdatahash" xmlns:w16sdtfl="http://schemas.microsoft.com/office/word/2024/wordml/sdtformatlock" xmlns:w16se="http://schemas.microsoft.com/office/word/2015/wordml/symex" xmlns:wpg="http://schemas.microsoft.com/office/word/2010/wordprocessingGroup" xmlns:wpi="http://schemas.microsoft.com/office/word/2010/wordprocessingInk" xmlns:wne="http://schemas.microsoft.com/office/word/2006/wordml" xmlns:wps="http://schemas.microsoft.com/office/word/2010/wordprocessingShape" mc:Ignorable="w14 w15 w16se w16cid w16 w16cex w16sdtdh w16sdtfl w16du wp14">
   <w:abstractNum w:abstractNumId="0" w15:restartNumberingAfterBreak="0">
+    <w:nsid w:val="1A8E6996"/>
+    <w:multiLevelType w:val="multilevel"/>
+    <w:tmpl w:val="818C581A"/>
+    <w:lvl w:ilvl="0">
+      <w:start w:val="1"/>
+      <w:numFmt w:val="decimal"/>
+      <w:lvlText w:val="%1."/>
+      <w:lvlJc w:val="left"/>
+      <w:pPr>
+        <w:tabs>
+          <w:tab w:val="num" w:pos="720"/>
+        </w:tabs>
+        <w:ind w:left="720" w:hanging="360"/>
+      </w:pPr>
+    </w:lvl>
+    <w:lvl w:ilvl="1">
+      <w:numFmt w:val="bullet"/>
+      <w:lvlText w:val="-"/>
+      <w:lvlJc w:val="left"/>
+      <w:pPr>
+        <w:ind w:left="1440" w:hanging="360"/>
+      </w:pPr>
+      <w:rPr>
+        <w:rFonts w:ascii="Calibri" w:eastAsiaTheme="minorHAnsi" w:hAnsi="Calibri" w:cs="Calibri" w:hint="default"/>
+      </w:rPr>
+    </w:lvl>
+    <w:lvl w:ilvl="2" w:tentative="1">
+      <w:start w:val="1"/>
+      <w:numFmt w:val="decimal"/>
+      <w:lvlText w:val="%3."/>
+      <w:lvlJc w:val="left"/>
+      <w:pPr>
+        <w:tabs>
+          <w:tab w:val="num" w:pos="2160"/>
+        </w:tabs>
+        <w:ind w:left="2160" w:hanging="360"/>
+      </w:pPr>
+    </w:lvl>
+    <w:lvl w:ilvl="3" w:tentative="1">
+      <w:start w:val="1"/>
+      <w:numFmt w:val="decimal"/>
+      <w:lvlText w:val="%4."/>
+      <w:lvlJc w:val="left"/>
+      <w:pPr>
+        <w:tabs>
+          <w:tab w:val="num" w:pos="2880"/>
+        </w:tabs>
+        <w:ind w:left="2880" w:hanging="360"/>
+      </w:pPr>
+    </w:lvl>
+    <w:lvl w:ilvl="4" w:tentative="1">
+      <w:start w:val="1"/>
+      <w:numFmt w:val="decimal"/>
+      <w:lvlText w:val="%5."/>
+      <w:lvlJc w:val="left"/>
+      <w:pPr>
+        <w:tabs>
+          <w:tab w:val="num" w:pos="3600"/>
+        </w:tabs>
+        <w:ind w:left="3600" w:hanging="360"/>
+      </w:pPr>
+    </w:lvl>
+    <w:lvl w:ilvl="5" w:tentative="1">
+      <w:start w:val="1"/>
+      <w:numFmt w:val="decimal"/>
+      <w:lvlText w:val="%6."/>
+      <w:lvlJc w:val="left"/>
+      <w:pPr>
+        <w:tabs>
+          <w:tab w:val="num" w:pos="4320"/>
+        </w:tabs>
+        <w:ind w:left="4320" w:hanging="360"/>
+      </w:pPr>
+    </w:lvl>
+    <w:lvl w:ilvl="6" w:tentative="1">
+      <w:start w:val="1"/>
+      <w:numFmt w:val="decimal"/>
+      <w:lvlText w:val="%7."/>
+      <w:lvlJc w:val="left"/>
+      <w:pPr>
+        <w:tabs>
+          <w:tab w:val="num" w:pos="5040"/>
+        </w:tabs>
+        <w:ind w:left="5040" w:hanging="360"/>
+      </w:pPr>
+    </w:lvl>
+    <w:lvl w:ilvl="7" w:tentative="1">
+      <w:start w:val="1"/>
+      <w:numFmt w:val="decimal"/>
+      <w:lvlText w:val="%8."/>
+      <w:lvlJc w:val="left"/>
+      <w:pPr>
+        <w:tabs>
+          <w:tab w:val="num" w:pos="5760"/>
+        </w:tabs>
+        <w:ind w:left="5760" w:hanging="360"/>
+      </w:pPr>
+    </w:lvl>
+    <w:lvl w:ilvl="8" w:tentative="1">
+      <w:start w:val="1"/>
+      <w:numFmt w:val="decimal"/>
+      <w:lvlText w:val="%9."/>
+      <w:lvlJc w:val="left"/>
+      <w:pPr>
+        <w:tabs>
+          <w:tab w:val="num" w:pos="6480"/>
+        </w:tabs>
+        <w:ind w:left="6480" w:hanging="360"/>
+      </w:pPr>
+    </w:lvl>
+  </w:abstractNum>
+  <w:abstractNum w:abstractNumId="1" w15:restartNumberingAfterBreak="0">
     <w:nsid w:val="57EC5099"/>
     <w:multiLevelType w:val="multilevel"/>
     <w:tmpl w:val="7D940E28"/>
@@ -1945,6 +2728,9 @@
     </w:lvl>
   </w:abstractNum>
   <w:num w:numId="1" w16cid:durableId="945843563">
+    <w:abstractNumId w:val="1"/>
+  </w:num>
+  <w:num w:numId="2" w16cid:durableId="991103974">
     <w:abstractNumId w:val="0"/>
   </w:num>
 </w:numbering>

</xml_diff>